<commit_message>
CGV : prix renvoyés au devis
Co-Authored-By: Claude Opus 5.5 <noreply@anthropic.com>
</commit_message>
<xml_diff>
--- a/CGV-Hyper-Fractional-B2B-v2.docx
+++ b/CGV-Hyper-Fractional-B2B-v2.docx
@@ -484,153 +484,49 @@
           <w:sz w:val="21"/>
           <w:szCs w:val="21"/>
         </w:rPr>
-        <w:t xml:space="preserve">Deux options de paiement sont proposées au Client :</w:t>
-      </w:r>
-    </w:p>
-    <w:p>
-      <w:pPr>
-        <w:keepNext/>
-        <w:spacing w:after="60" w:before="160"/>
-      </w:pPr>
-      <w:r>
-        <w:rPr>
-          <w:rFonts w:ascii="Calibri" w:cs="Calibri" w:eastAsia="Calibri" w:hAnsi="Calibri"/>
-          <w:b/>
-          <w:bCs/>
-          <w:i/>
-          <w:iCs/>
-          <w:sz w:val="21"/>
-          <w:szCs w:val="21"/>
-        </w:rPr>
-        <w:t xml:space="preserve">Option 1 : paiement en une fois par virement bancaire</w:t>
-      </w:r>
-    </w:p>
-    <w:p>
-      <w:pPr>
-        <w:spacing w:after="120" w:line="276"/>
-        <w:jc w:val="both"/>
-      </w:pPr>
-      <w:r>
-        <w:rPr>
-          <w:rFonts w:ascii="Calibri" w:cs="Calibri" w:eastAsia="Calibri" w:hAnsi="Calibri"/>
-          <w:sz w:val="21"/>
-          <w:szCs w:val="21"/>
-        </w:rPr>
-        <w:t xml:space="preserve">5 000 € HT, soit 6 000 € TTC (TVA 20 %), payable par virement bancaire à la Société (Dose of Marketing). Les coordonnées bancaires (RIB) sont communiquées par email au Client après validation de la Commande. Le paiement vaut acceptation ferme et définitive.</w:t>
-      </w:r>
-    </w:p>
-    <w:p>
-      <w:pPr>
-        <w:keepNext/>
-        <w:spacing w:after="60" w:before="160"/>
-      </w:pPr>
-      <w:r>
-        <w:rPr>
-          <w:rFonts w:ascii="Calibri" w:cs="Calibri" w:eastAsia="Calibri" w:hAnsi="Calibri"/>
-          <w:b/>
-          <w:bCs/>
-          <w:i/>
-          <w:iCs/>
-          <w:sz w:val="21"/>
-          <w:szCs w:val="21"/>
-        </w:rPr>
-        <w:t xml:space="preserve">Option 2 : paiement échelonné en 3 fois par prélèvement GoCardless</w:t>
-      </w:r>
-    </w:p>
-    <w:p>
-      <w:pPr>
-        <w:spacing w:after="120" w:line="276"/>
-        <w:jc w:val="both"/>
-      </w:pPr>
-      <w:r>
-        <w:rPr>
-          <w:rFonts w:ascii="Calibri" w:cs="Calibri" w:eastAsia="Calibri" w:hAnsi="Calibri"/>
-          <w:sz w:val="21"/>
-          <w:szCs w:val="21"/>
-        </w:rPr>
-        <w:t xml:space="preserve">6 000 € HT, soit 7 200 € TTC (TVA 20 %), répartis comme suit :</w:t>
-      </w:r>
-    </w:p>
-    <w:p>
-      <w:pPr>
-        <w:pStyle w:val="ListParagraph"/>
-        <w:numPr>
-          <w:ilvl w:val="0"/>
-          <w:numId w:val="2"/>
-        </w:numPr>
-        <w:spacing w:after="60"/>
-      </w:pPr>
-      <w:r>
-        <w:rPr>
-          <w:rFonts w:ascii="Calibri" w:cs="Calibri" w:eastAsia="Calibri" w:hAnsi="Calibri"/>
-          <w:sz w:val="21"/>
-          <w:szCs w:val="21"/>
-        </w:rPr>
-        <w:t xml:space="preserve">1er prélèvement de 2 400 € TTC à la Commande</w:t>
-      </w:r>
-    </w:p>
-    <w:p>
-      <w:pPr>
-        <w:pStyle w:val="ListParagraph"/>
-        <w:numPr>
-          <w:ilvl w:val="0"/>
-          <w:numId w:val="2"/>
-        </w:numPr>
-        <w:spacing w:after="60"/>
-      </w:pPr>
-      <w:r>
-        <w:rPr>
-          <w:rFonts w:ascii="Calibri" w:cs="Calibri" w:eastAsia="Calibri" w:hAnsi="Calibri"/>
-          <w:sz w:val="21"/>
-          <w:szCs w:val="21"/>
-        </w:rPr>
-        <w:t xml:space="preserve">2ème prélèvement de 2 400 € TTC trente (30) jours après la Commande</w:t>
-      </w:r>
-    </w:p>
-    <w:p>
-      <w:pPr>
-        <w:pStyle w:val="ListParagraph"/>
-        <w:numPr>
-          <w:ilvl w:val="0"/>
-          <w:numId w:val="2"/>
-        </w:numPr>
-        <w:spacing w:after="60"/>
-      </w:pPr>
-      <w:r>
-        <w:rPr>
-          <w:rFonts w:ascii="Calibri" w:cs="Calibri" w:eastAsia="Calibri" w:hAnsi="Calibri"/>
-          <w:sz w:val="21"/>
-          <w:szCs w:val="21"/>
-        </w:rPr>
-        <w:t xml:space="preserve">3ème prélèvement de 2 400 € TTC soixante (60) jours après la Commande</w:t>
-      </w:r>
-    </w:p>
-    <w:p>
-      <w:pPr>
-        <w:spacing w:after="120" w:line="276"/>
-        <w:jc w:val="both"/>
-      </w:pPr>
-      <w:r>
-        <w:rPr>
-          <w:rFonts w:ascii="Calibri" w:cs="Calibri" w:eastAsia="Calibri" w:hAnsi="Calibri"/>
-          <w:sz w:val="21"/>
-          <w:szCs w:val="21"/>
-        </w:rPr>
-        <w:t xml:space="preserve">Les prélèvements sont effectués via la plateforme de paiement GoCardless. Le Client autorise la mise en place du mandat de prélèvement SEPA correspondant.</w:t>
-      </w:r>
-    </w:p>
-    <w:p>
-      <w:pPr>
-        <w:spacing w:after="120" w:line="276"/>
-        <w:jc w:val="both"/>
-      </w:pPr>
-      <w:r>
-        <w:rPr>
-          <w:rFonts w:ascii="Calibri" w:cs="Calibri" w:eastAsia="Calibri" w:hAnsi="Calibri"/>
-          <w:sz w:val="21"/>
-          <w:szCs w:val="21"/>
-        </w:rPr>
-        <w:t xml:space="preserve">Tout paiement échelonné constitue un engagement ferme et irrévocable de régler l'intégralité du prix convenu, indépendamment du mode de paiement choisi.</w:t>
+        <w:t xml:space="preserve">Le prix du Service et ses modalités de paiement, en une fois ou de manière échelonnée, sont ceux indiqués dans le Devis ou la proposition commerciale communiqués au Client avant la Commande. Les prix sont exprimés hors taxes et majorés de la TVA au taux en vigueur.</w:t>
+      </w:r>
+    </w:p>
+    <w:p>
+      <w:pPr>
+        <w:spacing w:after="120" w:line="276"/>
+        <w:jc w:val="both"/>
+      </w:pPr>
+      <w:r>
+        <w:rPr>
+          <w:rFonts w:ascii="Calibri" w:cs="Calibri" w:eastAsia="Calibri" w:hAnsi="Calibri"/>
+          <w:sz w:val="21"/>
+          <w:szCs w:val="21"/>
+        </w:rPr>
+        <w:t xml:space="preserve">Le paiement en une fois s'effectue par virement bancaire. Les coordonnées bancaires (RIB) sont communiquées au Client après validation de la Commande.</w:t>
+      </w:r>
+    </w:p>
+    <w:p>
+      <w:pPr>
+        <w:spacing w:after="120" w:line="276"/>
+        <w:jc w:val="both"/>
+      </w:pPr>
+      <w:r>
+        <w:rPr>
+          <w:rFonts w:ascii="Calibri" w:cs="Calibri" w:eastAsia="Calibri" w:hAnsi="Calibri"/>
+          <w:sz w:val="21"/>
+          <w:szCs w:val="21"/>
+        </w:rPr>
+        <w:t xml:space="preserve">Le paiement échelonné s'effectue par prélèvement SEPA via la plateforme GoCardless, selon l'échéancier indiqué dans le Devis ou la proposition commerciale. Le Client autorise la mise en place du mandat de prélèvement correspondant.</w:t>
+      </w:r>
+    </w:p>
+    <w:p>
+      <w:pPr>
+        <w:spacing w:after="120" w:line="276"/>
+        <w:jc w:val="both"/>
+      </w:pPr>
+      <w:r>
+        <w:rPr>
+          <w:rFonts w:ascii="Calibri" w:cs="Calibri" w:eastAsia="Calibri" w:hAnsi="Calibri"/>
+          <w:sz w:val="21"/>
+          <w:szCs w:val="21"/>
+        </w:rPr>
+        <w:t xml:space="preserve">Tout paiement échelonné constitue un engagement ferme et irrévocable de régler l'intégralité du prix convenu.</w:t>
       </w:r>
     </w:p>
     <w:p>

</xml_diff>